<commit_message>
actividad Modelar la Base de Datos del Proyecto Formativo  (SenaLingua)
</commit_message>
<xml_diff>
--- a/Modelo De Base de Datos/Actividad 5/Identificar plataformas tecnológicas y arquitecturas en el desarrollo de software.docx
+++ b/Modelo De Base de Datos/Actividad 5/Identificar plataformas tecnológicas y arquitecturas en el desarrollo de software.docx
@@ -2815,8 +2815,71 @@
         </w:rPr>
       </w:pPr>
     </w:p>
+    <w:p>
+      <w:pPr>
+        <w:rPr>
+          <w:b/>
+          <w:bCs/>
+        </w:rPr>
+      </w:pPr>
+      <w:r>
+        <w:rPr>
+          <w:b/>
+          <w:bCs/>
+          <w:noProof/>
+        </w:rPr>
+        <w:drawing>
+          <wp:inline distT="0" distB="0" distL="0" distR="0" wp14:anchorId="33BBCF96" wp14:editId="52B5A5ED">
+            <wp:extent cx="5600700" cy="3733800"/>
+            <wp:effectExtent l="0" t="0" r="0" b="0"/>
+            <wp:docPr id="841619991" name="Imagen 2"/>
+            <wp:cNvGraphicFramePr>
+              <a:graphicFrameLocks xmlns:a="http://schemas.openxmlformats.org/drawingml/2006/main" noChangeAspect="1"/>
+            </wp:cNvGraphicFramePr>
+            <a:graphic xmlns:a="http://schemas.openxmlformats.org/drawingml/2006/main">
+              <a:graphicData uri="http://schemas.openxmlformats.org/drawingml/2006/picture">
+                <pic:pic xmlns:pic="http://schemas.openxmlformats.org/drawingml/2006/picture">
+                  <pic:nvPicPr>
+                    <pic:cNvPr id="0" name="Picture 2"/>
+                    <pic:cNvPicPr>
+                      <a:picLocks noChangeAspect="1" noChangeArrowheads="1"/>
+                    </pic:cNvPicPr>
+                  </pic:nvPicPr>
+                  <pic:blipFill>
+                    <a:blip r:embed="rId8" cstate="print">
+                      <a:extLst>
+                        <a:ext uri="{28A0092B-C50C-407E-A947-70E740481C1C}">
+                          <a14:useLocalDpi xmlns:a14="http://schemas.microsoft.com/office/drawing/2010/main" val="0"/>
+                        </a:ext>
+                      </a:extLst>
+                    </a:blip>
+                    <a:srcRect/>
+                    <a:stretch>
+                      <a:fillRect/>
+                    </a:stretch>
+                  </pic:blipFill>
+                  <pic:spPr bwMode="auto">
+                    <a:xfrm>
+                      <a:off x="0" y="0"/>
+                      <a:ext cx="5600700" cy="3733800"/>
+                    </a:xfrm>
+                    <a:prstGeom prst="rect">
+                      <a:avLst/>
+                    </a:prstGeom>
+                    <a:noFill/>
+                    <a:ln>
+                      <a:noFill/>
+                    </a:ln>
+                  </pic:spPr>
+                </pic:pic>
+              </a:graphicData>
+            </a:graphic>
+          </wp:inline>
+        </w:drawing>
+      </w:r>
+    </w:p>
     <w:sectPr>
-      <w:headerReference w:type="default" r:id="rId8"/>
+      <w:headerReference w:type="default" r:id="rId9"/>
       <w:pgSz w:w="12240" w:h="15840"/>
       <w:pgMar w:top="1417" w:right="1701" w:bottom="1417" w:left="1701" w:header="708" w:footer="708" w:gutter="0"/>
       <w:pgNumType w:start="1"/>

</xml_diff>